<commit_message>
Atualiza documentos de casos de uso CSU01 a CSU10
</commit_message>
<xml_diff>
--- a/Requisitos/CSU01 - ManterSolicitacaoEntrega.docx
+++ b/Requisitos/CSU01 - ManterSolicitacaoEntrega.docx
@@ -504,7 +504,15 @@
                 <w:sz w:val="32"/>
                 <w:szCs w:val="32"/>
               </w:rPr>
-              <w:t xml:space="preserve">clica em </w:t>
+              <w:t>vai para a página inicial para</w:t>
+            </w:r>
+            <w:r>
+              <w:rPr>
+                <w:bCs/>
+                <w:sz w:val="32"/>
+                <w:szCs w:val="32"/>
+              </w:rPr>
+              <w:t xml:space="preserve"> </w:t>
             </w:r>
             <w:r>
               <w:rPr>
@@ -513,6 +521,75 @@
                 <w:szCs w:val="32"/>
               </w:rPr>
               <w:t>“Nova Solicitação”</w:t>
+            </w:r>
+            <w:r>
+              <w:rPr>
+                <w:bCs/>
+                <w:sz w:val="32"/>
+                <w:szCs w:val="32"/>
+              </w:rPr>
+              <w:t xml:space="preserve"> </w:t>
+            </w:r>
+            <w:r>
+              <w:rPr>
+                <w:bCs/>
+                <w:sz w:val="32"/>
+                <w:szCs w:val="32"/>
+              </w:rPr>
+              <w:t>(</w:t>
+            </w:r>
+            <w:r>
+              <w:rPr>
+                <w:bCs/>
+                <w:color w:val="FF0000"/>
+                <w:sz w:val="32"/>
+                <w:szCs w:val="32"/>
+              </w:rPr>
+              <w:t>Tela</w:t>
+            </w:r>
+            <w:r>
+              <w:rPr>
+                <w:bCs/>
+                <w:color w:val="FF0000"/>
+                <w:sz w:val="32"/>
+                <w:szCs w:val="32"/>
+              </w:rPr>
+              <w:t>_</w:t>
+            </w:r>
+            <w:r>
+              <w:rPr>
+                <w:bCs/>
+                <w:color w:val="FF0000"/>
+                <w:sz w:val="32"/>
+                <w:szCs w:val="32"/>
+              </w:rPr>
+              <w:t>0</w:t>
+            </w:r>
+            <w:r>
+              <w:rPr>
+                <w:bCs/>
+                <w:color w:val="FF0000"/>
+                <w:sz w:val="32"/>
+                <w:szCs w:val="32"/>
+              </w:rPr>
+              <w:t>0</w:t>
+            </w:r>
+            <w:r>
+              <w:rPr>
+                <w:bCs/>
+                <w:color w:val="FF0000"/>
+                <w:sz w:val="32"/>
+                <w:szCs w:val="32"/>
+              </w:rPr>
+              <w:t>7</w:t>
+            </w:r>
+            <w:r>
+              <w:rPr>
+                <w:bCs/>
+                <w:sz w:val="32"/>
+                <w:szCs w:val="32"/>
+              </w:rPr>
+              <w:t>)</w:t>
             </w:r>
             <w:r>
               <w:rPr>
@@ -551,6 +628,14 @@
                 <w:sz w:val="32"/>
                 <w:szCs w:val="32"/>
               </w:rPr>
+              <w:t xml:space="preserve">a </w:t>
+            </w:r>
+            <w:r>
+              <w:rPr>
+                <w:bCs/>
+                <w:sz w:val="32"/>
+                <w:szCs w:val="32"/>
+              </w:rPr>
               <w:t xml:space="preserve">tela </w:t>
             </w:r>
             <w:r>
@@ -558,17 +643,8 @@
                 <w:bCs/>
                 <w:sz w:val="32"/>
                 <w:szCs w:val="32"/>
-                <w:u w:val="single"/>
-              </w:rPr>
-              <w:t>de</w:t>
-            </w:r>
-            <w:r>
-              <w:rPr>
-                <w:bCs/>
-                <w:sz w:val="32"/>
-                <w:szCs w:val="32"/>
-              </w:rPr>
-              <w:t xml:space="preserve"> </w:t>
+              </w:rPr>
+              <w:t xml:space="preserve">de </w:t>
             </w:r>
             <w:r>
               <w:rPr>
@@ -584,7 +660,15 @@
                 <w:sz w:val="32"/>
                 <w:szCs w:val="32"/>
               </w:rPr>
-              <w:t>, (</w:t>
+              <w:t xml:space="preserve">, </w:t>
+            </w:r>
+            <w:r>
+              <w:rPr>
+                <w:bCs/>
+                <w:sz w:val="32"/>
+                <w:szCs w:val="32"/>
+              </w:rPr>
+              <w:t>(</w:t>
             </w:r>
             <w:r>
               <w:rPr>
@@ -593,7 +677,15 @@
                 <w:sz w:val="32"/>
                 <w:szCs w:val="32"/>
               </w:rPr>
-              <w:t>Tela</w:t>
+              <w:t>Tela_008</w:t>
+            </w:r>
+            <w:r>
+              <w:rPr>
+                <w:bCs/>
+                <w:sz w:val="32"/>
+                <w:szCs w:val="32"/>
+              </w:rPr>
+              <w:t>/</w:t>
             </w:r>
             <w:r>
               <w:rPr>
@@ -602,41 +694,23 @@
                 <w:sz w:val="32"/>
                 <w:szCs w:val="32"/>
               </w:rPr>
-              <w:t>_</w:t>
-            </w:r>
-            <w:r>
-              <w:rPr>
-                <w:bCs/>
-                <w:color w:val="FF0000"/>
-                <w:sz w:val="32"/>
-                <w:szCs w:val="32"/>
-              </w:rPr>
-              <w:t>05</w:t>
-            </w:r>
-            <w:r>
-              <w:rPr>
-                <w:bCs/>
-                <w:sz w:val="32"/>
-                <w:szCs w:val="32"/>
-              </w:rPr>
-              <w:t>/</w:t>
-            </w:r>
-            <w:r>
-              <w:rPr>
-                <w:bCs/>
-                <w:color w:val="FF0000"/>
-                <w:sz w:val="32"/>
-                <w:szCs w:val="32"/>
-              </w:rPr>
-              <w:t>Tela_06</w:t>
-            </w:r>
-            <w:r>
-              <w:rPr>
-                <w:bCs/>
-                <w:sz w:val="32"/>
-                <w:szCs w:val="32"/>
-              </w:rPr>
-              <w:t>).</w:t>
+              <w:t>Tela_009</w:t>
+            </w:r>
+            <w:r>
+              <w:rPr>
+                <w:bCs/>
+                <w:sz w:val="32"/>
+                <w:szCs w:val="32"/>
+              </w:rPr>
+              <w:t>)</w:t>
+            </w:r>
+            <w:r>
+              <w:rPr>
+                <w:bCs/>
+                <w:sz w:val="32"/>
+                <w:szCs w:val="32"/>
+              </w:rPr>
+              <w:t>.</w:t>
             </w:r>
           </w:p>
           <w:p>
@@ -667,7 +741,15 @@
                 <w:sz w:val="32"/>
                 <w:szCs w:val="32"/>
               </w:rPr>
-              <w:t xml:space="preserve"> (</w:t>
+              <w:t xml:space="preserve"> </w:t>
+            </w:r>
+            <w:r>
+              <w:rPr>
+                <w:bCs/>
+                <w:sz w:val="32"/>
+                <w:szCs w:val="32"/>
+              </w:rPr>
+              <w:t>(</w:t>
             </w:r>
             <w:r>
               <w:rPr>
@@ -676,7 +758,7 @@
                 <w:sz w:val="32"/>
                 <w:szCs w:val="32"/>
               </w:rPr>
-              <w:t>Tela_05</w:t>
+              <w:t>Tela_008</w:t>
             </w:r>
             <w:r>
               <w:rPr>
@@ -693,7 +775,7 @@
                 <w:sz w:val="32"/>
                 <w:szCs w:val="32"/>
               </w:rPr>
-              <w:t>Tela_06</w:t>
+              <w:t>Tela_009</w:t>
             </w:r>
             <w:r>
               <w:rPr>
@@ -742,7 +824,6 @@
               </w:rPr>
               <w:t xml:space="preserve">(&lt;&lt;include&gt;&gt; </w:t>
             </w:r>
-            <w:proofErr w:type="spellStart"/>
             <w:r>
               <w:rPr>
                 <w:bCs/>
@@ -751,7 +832,6 @@
               </w:rPr>
               <w:t>CalcularFrete</w:t>
             </w:r>
-            <w:proofErr w:type="spellEnd"/>
             <w:r>
               <w:rPr>
                 <w:bCs/>
@@ -783,7 +863,16 @@
                 <w:sz w:val="32"/>
                 <w:szCs w:val="32"/>
               </w:rPr>
-              <w:t>Tela_07</w:t>
+              <w:t>Tel</w:t>
+            </w:r>
+            <w:r>
+              <w:rPr>
+                <w:bCs/>
+                <w:color w:val="FF0000"/>
+                <w:sz w:val="32"/>
+                <w:szCs w:val="32"/>
+              </w:rPr>
+              <w:t>a_010</w:t>
             </w:r>
             <w:r>
               <w:rPr>
@@ -839,7 +928,16 @@
                 <w:sz w:val="32"/>
                 <w:szCs w:val="32"/>
               </w:rPr>
-              <w:t>Tela_07</w:t>
+              <w:t>Tela_0</w:t>
+            </w:r>
+            <w:r>
+              <w:rPr>
+                <w:bCs/>
+                <w:color w:val="FF0000"/>
+                <w:sz w:val="32"/>
+                <w:szCs w:val="32"/>
+              </w:rPr>
+              <w:t>10</w:t>
             </w:r>
             <w:r>
               <w:rPr>
@@ -895,7 +993,16 @@
                 <w:sz w:val="32"/>
                 <w:szCs w:val="32"/>
               </w:rPr>
-              <w:t>Tela_08</w:t>
+              <w:t>Tela_0</w:t>
+            </w:r>
+            <w:r>
+              <w:rPr>
+                <w:bCs/>
+                <w:color w:val="FF0000"/>
+                <w:sz w:val="32"/>
+                <w:szCs w:val="32"/>
+              </w:rPr>
+              <w:t>11</w:t>
             </w:r>
             <w:r>
               <w:rPr>
@@ -942,15 +1049,7 @@
                 <w:sz w:val="32"/>
                 <w:szCs w:val="32"/>
               </w:rPr>
-              <w:t xml:space="preserve"> </w:t>
-            </w:r>
-            <w:r>
-              <w:rPr>
-                <w:bCs/>
-                <w:sz w:val="32"/>
-                <w:szCs w:val="32"/>
-              </w:rPr>
-              <w:t>(</w:t>
+              <w:t xml:space="preserve"> (</w:t>
             </w:r>
             <w:r>
               <w:rPr>
@@ -968,7 +1067,7 @@
                 <w:sz w:val="32"/>
                 <w:szCs w:val="32"/>
               </w:rPr>
-              <w:t>9</w:t>
+              <w:t>12</w:t>
             </w:r>
             <w:r>
               <w:rPr>
@@ -1079,9 +1178,8 @@
                 <w:sz w:val="28"/>
                 <w:szCs w:val="28"/>
               </w:rPr>
-              <w:t>Solicitante clica em ‘Editar’ e não em ‘Nova solicitação</w:t>
-            </w:r>
-            <w:proofErr w:type="gramStart"/>
+              <w:t>Solicitante clica em ‘Editar’ e não em ‘Nova solicitação’ . O sistema carrega endereço salvo e segue a partir da linha 2. Somente permitido se status = “Aguardando Entregador”</w:t>
+            </w:r>
             <w:r>
               <w:rPr>
                 <w:rStyle w:val="Forte"/>
@@ -1090,78 +1188,47 @@
                 <w:sz w:val="28"/>
                 <w:szCs w:val="28"/>
               </w:rPr>
-              <w:t>’ .</w:t>
-            </w:r>
-            <w:proofErr w:type="gramEnd"/>
+              <w:t>.</w:t>
+            </w:r>
+          </w:p>
+          <w:p>
+            <w:pPr>
+              <w:pStyle w:val="Ttulo2"/>
+              <w:jc w:val="left"/>
+              <w:rPr>
+                <w:b/>
+                <w:bCs/>
+              </w:rPr>
+            </w:pPr>
+            <w:r>
+              <w:rPr>
+                <w:rFonts w:hAnsi="Symbol"/>
+                <w:sz w:val="24"/>
+                <w:szCs w:val="24"/>
+              </w:rPr>
+              <w:t></w:t>
+            </w:r>
+            <w:r>
+              <w:rPr>
+                <w:b/>
+                <w:bCs/>
+              </w:rPr>
+              <w:t xml:space="preserve"> </w:t>
+            </w:r>
+            <w:r>
+              <w:rPr>
+                <w:rStyle w:val="Forte"/>
+              </w:rPr>
+              <w:t>Linha 6</w:t>
+            </w:r>
             <w:r>
               <w:rPr>
                 <w:rStyle w:val="Forte"/>
                 <w:b w:val="0"/>
                 <w:bCs w:val="0"/>
-                <w:sz w:val="28"/>
-                <w:szCs w:val="28"/>
-              </w:rPr>
-              <w:t xml:space="preserve"> O sistema carrega endereço salvo e segue a partir da linha 2. Somente permitido se status = “Aguardando Entregador”</w:t>
-            </w:r>
-            <w:r>
-              <w:rPr>
-                <w:rStyle w:val="Forte"/>
-                <w:b w:val="0"/>
-                <w:bCs w:val="0"/>
-                <w:sz w:val="28"/>
-                <w:szCs w:val="28"/>
-              </w:rPr>
-              <w:t>.</w:t>
-            </w:r>
-          </w:p>
-          <w:p>
-            <w:pPr>
-              <w:pStyle w:val="Ttulo2"/>
-              <w:jc w:val="left"/>
-              <w:rPr>
-                <w:b/>
-                <w:bCs/>
-              </w:rPr>
-            </w:pPr>
-            <w:r>
-              <w:rPr>
-                <w:rFonts w:hAnsi="Symbol"/>
-                <w:sz w:val="24"/>
-                <w:szCs w:val="24"/>
-              </w:rPr>
-              <w:t></w:t>
-            </w:r>
-            <w:r>
-              <w:rPr>
-                <w:b/>
-                <w:bCs/>
-              </w:rPr>
-              <w:t xml:space="preserve"> </w:t>
-            </w:r>
-            <w:r>
-              <w:rPr>
-                <w:rStyle w:val="Forte"/>
-              </w:rPr>
-              <w:t>Linha 6</w:t>
-            </w:r>
-            <w:r>
-              <w:rPr>
-                <w:rStyle w:val="Forte"/>
-                <w:b w:val="0"/>
-                <w:bCs w:val="0"/>
-              </w:rPr>
-              <w:t xml:space="preserve">: Solicitante cancela antes da entrega ser concluída. Se já houve pagamento, acione </w:t>
-            </w:r>
-            <w:proofErr w:type="spellStart"/>
-            <w:r>
-              <w:rPr>
-                <w:rStyle w:val="Forte"/>
-                <w:b w:val="0"/>
-                <w:bCs w:val="0"/>
-              </w:rPr>
-              <w:t>EstornarPagamento</w:t>
-            </w:r>
-            <w:proofErr w:type="spellEnd"/>
+              </w:rPr>
+              <w:t>: Solicitante cancela antes da entrega ser concluída. Se já houve pagamento, acione EstornarPagamento</w:t>
+            </w:r>
             <w:r>
               <w:rPr>
                 <w:rStyle w:val="Forte"/>
@@ -1476,13 +1543,8 @@
               <w:jc w:val="center"/>
             </w:pPr>
             <w:r>
-              <w:t xml:space="preserve">Marcos </w:t>
-            </w:r>
-            <w:proofErr w:type="spellStart"/>
-            <w:r>
-              <w:t>Dósea</w:t>
-            </w:r>
-            <w:proofErr w:type="spellEnd"/>
+              <w:t>Marcos Dósea</w:t>
+            </w:r>
           </w:p>
         </w:tc>
         <w:tc>
@@ -1543,13 +1605,8 @@
               <w:jc w:val="center"/>
             </w:pPr>
             <w:r>
-              <w:t xml:space="preserve">Marcos </w:t>
-            </w:r>
-            <w:proofErr w:type="spellStart"/>
-            <w:r>
-              <w:t>Dósea</w:t>
-            </w:r>
-            <w:proofErr w:type="spellEnd"/>
+              <w:t>Marcos Dósea</w:t>
+            </w:r>
           </w:p>
         </w:tc>
         <w:tc>
@@ -1610,13 +1667,8 @@
               <w:jc w:val="center"/>
             </w:pPr>
             <w:r>
-              <w:t xml:space="preserve">Marcos </w:t>
-            </w:r>
-            <w:proofErr w:type="spellStart"/>
-            <w:r>
-              <w:t>Dósea</w:t>
-            </w:r>
-            <w:proofErr w:type="spellEnd"/>
+              <w:t>Marcos Dósea</w:t>
+            </w:r>
           </w:p>
         </w:tc>
         <w:tc>
@@ -1677,13 +1729,8 @@
               <w:jc w:val="center"/>
             </w:pPr>
             <w:r>
-              <w:t xml:space="preserve">Marcos </w:t>
-            </w:r>
-            <w:proofErr w:type="spellStart"/>
-            <w:r>
-              <w:t>Dósea</w:t>
-            </w:r>
-            <w:proofErr w:type="spellEnd"/>
+              <w:t>Marcos Dósea</w:t>
+            </w:r>
           </w:p>
         </w:tc>
         <w:tc>

</xml_diff>